<commit_message>
Document project portfolio improvements
</commit_message>
<xml_diff>
--- a/docs/product/PRD_Personal_Brand_Platform_COMMERCE_READY.docx
+++ b/docs/product/PRD_Personal_Brand_Platform_COMMERCE_READY.docx
@@ -4941,6 +4941,275 @@
         <w:t>Walaupun theme bisa diganti-ganti, semua theme wajib mendukung minimal commerce navigation: Products list, Product detail, Buy Now link, dan status produk. Pada fase proper commerce, theme perlu mendukung Checkout, Payment Success, Payment Failed, dan Order Status page.</w:t>
       </w:r>
     </w:p>
+    <w:p>
+      <w:r>
+        <w:rPr>
+          <w:sz w:val="21"/>
+        </w:rPr>
+        <w:t/>
+      </w:r>
+    </w:p>
+    <w:p>
+      <w:pPr>
+        <w:pStyle w:val="Heading1"/>
+      </w:pPr>
+      <w:r>
+        <w:rPr>
+          <w:sz w:val="21"/>
+        </w:rPr>
+        <w:t>Project Portfolio Recruiter Addendum</w:t>
+      </w:r>
+    </w:p>
+    <w:p>
+      <w:r>
+        <w:rPr>
+          <w:sz w:val="21"/>
+        </w:rPr>
+        <w:t>Tujuan update ini: membuat fitur Projects menjadi portfolio utama untuk mencari kerja Software Engineer, bukan sekadar daftar project. Halaman /work dan /work/:slug harus membantu recruiter melihat role, seniority, technical depth, business impact, dan evidence dari setiap project.</w:t>
+      </w:r>
+    </w:p>
+    <w:p>
+      <w:pPr>
+        <w:pStyle w:val="Heading2"/>
+      </w:pPr>
+      <w:r>
+        <w:rPr>
+          <w:sz w:val="21"/>
+        </w:rPr>
+        <w:t>Target User Tambahan</w:t>
+      </w:r>
+    </w:p>
+    <w:p>
+      <w:pPr>
+        <w:pStyle w:val="ListBullet"/>
+      </w:pPr>
+      <w:r>
+        <w:rPr>
+          <w:sz w:val="21"/>
+        </w:rPr>
+        <w:t>Recruiter dan hiring manager yang ingin menilai kecocokan kandidat secara cepat.</w:t>
+      </w:r>
+    </w:p>
+    <w:p>
+      <w:pPr>
+        <w:pStyle w:val="ListBullet"/>
+      </w:pPr>
+      <w:r>
+        <w:rPr>
+          <w:sz w:val="21"/>
+        </w:rPr>
+        <w:t>Engineering manager yang ingin melihat ownership, architecture decision, dan delivery impact.</w:t>
+      </w:r>
+    </w:p>
+    <w:p>
+      <w:pPr>
+        <w:pStyle w:val="ListBullet"/>
+      </w:pPr>
+      <w:r>
+        <w:rPr>
+          <w:sz w:val="21"/>
+        </w:rPr>
+        <w:t>Technical interviewer yang ingin memilih project untuk didiskusikan saat interview.</w:t>
+      </w:r>
+    </w:p>
+    <w:p>
+      <w:pPr>
+        <w:pStyle w:val="Heading2"/>
+      </w:pPr>
+      <w:r>
+        <w:rPr>
+          <w:sz w:val="21"/>
+        </w:rPr>
+        <w:t>Project Case Study Requirements</w:t>
+      </w:r>
+    </w:p>
+    <w:p>
+      <w:pPr>
+        <w:pStyle w:val="ListBullet"/>
+      </w:pPr>
+      <w:r>
+        <w:rPr>
+          <w:sz w:val="21"/>
+        </w:rPr>
+        <w:t>Setiap project harus punya title, summary, role, platform/discipline, tech stack, year/duration, dan status publish.</w:t>
+      </w:r>
+    </w:p>
+    <w:p>
+      <w:pPr>
+        <w:pStyle w:val="ListBullet"/>
+      </w:pPr>
+      <w:r>
+        <w:rPr>
+          <w:sz w:val="21"/>
+        </w:rPr>
+        <w:t>Setiap project detail harus menjelaskan Overview, Problem, Solution, My Role/Ownership, Technical Approach, Trade-offs, dan Results/Impact.</w:t>
+      </w:r>
+    </w:p>
+    <w:p>
+      <w:pPr>
+        <w:pStyle w:val="ListBullet"/>
+      </w:pPr>
+      <w:r>
+        <w:rPr>
+          <w:sz w:val="21"/>
+        </w:rPr>
+        <w:t>Project profesional yang bersifat proprietary boleh memakai public-safe summary tanpa membuka detail rahasia perusahaan.</w:t>
+      </w:r>
+    </w:p>
+    <w:p>
+      <w:pPr>
+        <w:pStyle w:val="ListBullet"/>
+      </w:pPr>
+      <w:r>
+        <w:rPr>
+          <w:sz w:val="21"/>
+        </w:rPr>
+        <w:t>Admin harus bisa create dan edit project dengan cepat, termasuk revisi copy portfolio tanpa deploy ulang.</w:t>
+      </w:r>
+    </w:p>
+    <w:p>
+      <w:pPr>
+        <w:pStyle w:val="ListBullet"/>
+      </w:pPr>
+      <w:r>
+        <w:rPr>
+          <w:sz w:val="21"/>
+        </w:rPr>
+        <w:t>Slug sebaiknya dibuat otomatis dari title agar URL konsisten dan tidak redundant.</w:t>
+      </w:r>
+    </w:p>
+    <w:p>
+      <w:pPr>
+        <w:pStyle w:val="Heading2"/>
+      </w:pPr>
+      <w:r>
+        <w:rPr>
+          <w:sz w:val="21"/>
+        </w:rPr>
+        <w:t>Portfolio Classification</w:t>
+      </w:r>
+    </w:p>
+    <w:p>
+      <w:pPr>
+        <w:pStyle w:val="ListBullet"/>
+      </w:pPr>
+      <w:r>
+        <w:rPr>
+          <w:sz w:val="21"/>
+        </w:rPr>
+        <w:t>Platform yang perlu didukung: iOS, Android, Flutter, macOS, Web, Backend, dan Cross-platform.</w:t>
+      </w:r>
+    </w:p>
+    <w:p>
+      <w:pPr>
+        <w:pStyle w:val="ListBullet"/>
+      </w:pPr>
+      <w:r>
+        <w:rPr>
+          <w:sz w:val="21"/>
+        </w:rPr>
+        <w:t>Discipline yang perlu didukung: iOS Development, Mobile Engineering Lead, Mobile DevOps, Flutter Development, Backend Engineering, Frontend Engineering, Full-stack Engineering, macOS Development, Architecture, dan Performance Optimization.</w:t>
+      </w:r>
+    </w:p>
+    <w:p>
+      <w:pPr>
+        <w:pStyle w:val="Heading2"/>
+      </w:pPr>
+      <w:r>
+        <w:rPr>
+          <w:sz w:val="21"/>
+        </w:rPr>
+        <w:t>Public Experience</w:t>
+      </w:r>
+    </w:p>
+    <w:p>
+      <w:pPr>
+        <w:pStyle w:val="ListBullet"/>
+      </w:pPr>
+      <w:r>
+        <w:rPr>
+          <w:sz w:val="21"/>
+        </w:rPr>
+        <w:t>/work harus menampilkan project penting dengan filter atau grouping berdasarkan platform/discipline.</w:t>
+      </w:r>
+    </w:p>
+    <w:p>
+      <w:pPr>
+        <w:pStyle w:val="ListBullet"/>
+      </w:pPr>
+      <w:r>
+        <w:rPr>
+          <w:sz w:val="21"/>
+        </w:rPr>
+        <w:t>/work/:slug harus menjadi case study yang kuat untuk recruiter, dengan impact dan technical highlights yang mudah discan.</w:t>
+      </w:r>
+    </w:p>
+    <w:p>
+      <w:pPr>
+        <w:pStyle w:val="ListBullet"/>
+      </w:pPr>
+      <w:r>
+        <w:rPr>
+          <w:sz w:val="21"/>
+        </w:rPr>
+        <w:t>Project list harus menonjolkan impact summary, role, platform badges, tech stack singkat, dan tahun/periode.</w:t>
+      </w:r>
+    </w:p>
+    <w:p>
+      <w:pPr>
+        <w:pStyle w:val="Heading2"/>
+      </w:pPr>
+      <w:r>
+        <w:rPr>
+          <w:sz w:val="21"/>
+        </w:rPr>
+        <w:t>Admin Experience</w:t>
+      </w:r>
+    </w:p>
+    <w:p>
+      <w:pPr>
+        <w:pStyle w:val="ListBullet"/>
+      </w:pPr>
+      <w:r>
+        <w:rPr>
+          <w:sz w:val="21"/>
+        </w:rPr>
+        <w:t>/admin/projects harus mendukung list, create, dan edit project.</w:t>
+      </w:r>
+    </w:p>
+    <w:p>
+      <w:pPr>
+        <w:pStyle w:val="ListBullet"/>
+      </w:pPr>
+      <w:r>
+        <w:rPr>
+          <w:sz w:val="21"/>
+        </w:rPr>
+        <w:t>/admin/projects/new harus bisa membuat project tanpa mengetik slug manual.</w:t>
+      </w:r>
+    </w:p>
+    <w:p>
+      <w:pPr>
+        <w:pStyle w:val="ListBullet"/>
+      </w:pPr>
+      <w:r>
+        <w:rPr>
+          <w:sz w:val="21"/>
+        </w:rPr>
+        <w:t>/admin/projects/:id/edit harus nyaman untuk revisi data portfolio, termasuk warning jika slug project published diubah.</w:t>
+      </w:r>
+    </w:p>
+    <w:p>
+      <w:pPr>
+        <w:pStyle w:val="ListBullet"/>
+      </w:pPr>
+      <w:r>
+        <w:rPr>
+          <w:sz w:val="21"/>
+        </w:rPr>
+        <w:t>Cover image idealnya dipilih dari media library, bukan input UUID manual.</w:t>
+      </w:r>
+    </w:p>
     <w:sectPr>
       <w:footerReference w:type="default" r:id="rId9"/>
       <w:pgSz w:w="12240" w:h="15840"/>

</xml_diff>

<commit_message>
Add site setting public page fields
</commit_message>
<xml_diff>
--- a/docs/product/PRD_Personal_Brand_Platform_COMMERCE_READY.docx
+++ b/docs/product/PRD_Personal_Brand_Platform_COMMERCE_READY.docx
@@ -1,6 +1,6 @@
 
 <file path=word/document.xml><?xml version="1.0" encoding="utf-8"?>
-<w:document xmlns:wpc="http://schemas.microsoft.com/office/word/2010/wordprocessingCanvas" xmlns:mo="http://schemas.microsoft.com/office/mac/office/2008/main" xmlns:mc="http://schemas.openxmlformats.org/markup-compatibility/2006" xmlns:mv="urn:schemas-microsoft-com:mac:vml" xmlns:o="urn:schemas-microsoft-com:office:office" xmlns:r="http://schemas.openxmlformats.org/officeDocument/2006/relationships" xmlns:m="http://schemas.openxmlformats.org/officeDocument/2006/math" xmlns:v="urn:schemas-microsoft-com:vml" xmlns:wp14="http://schemas.microsoft.com/office/word/2010/wordprocessingDrawing" xmlns:wp="http://schemas.openxmlformats.org/drawingml/2006/wordprocessingDrawing" xmlns:w10="urn:schemas-microsoft-com:office:word" xmlns:w="http://schemas.openxmlformats.org/wordprocessingml/2006/main" xmlns:w14="http://schemas.microsoft.com/office/word/2010/wordml" xmlns:wpg="http://schemas.microsoft.com/office/word/2010/wordprocessingGroup" xmlns:wpi="http://schemas.microsoft.com/office/word/2010/wordprocessingInk" xmlns:wne="http://schemas.microsoft.com/office/word/2006/wordml" xmlns:wps="http://schemas.microsoft.com/office/word/2010/wordprocessingShape" mc:Ignorable="w14 wp14">
+<w:document xmlns:ns1="http://schemas.openxmlformats.org/markup-compatibility/2006" xmlns:r="http://schemas.openxmlformats.org/officeDocument/2006/relationships" xmlns:w="http://schemas.openxmlformats.org/wordprocessingml/2006/main" ns1:Ignorable="w14 wp14">
   <w:body>
     <w:p>
       <w:pPr>
@@ -5210,6 +5210,93 @@
         <w:t>Cover image idealnya dipilih dari media library, bukan input UUID manual.</w:t>
       </w:r>
     </w:p>
+    <w:p>
+      <w:pPr>
+        <w:pStyle w:val="Heading1"/>
+      </w:pPr>
+      <w:r>
+        <w:t>Content Monetization Update - Midtrans Only</w:t>
+      </w:r>
+    </w:p>
+    <w:p>
+      <w:r>
+        <w:t>This section syncs the PRD with the current monetization direction. Xendit is not part of the product plan because the available payment provider is Midtrans.</w:t>
+      </w:r>
+    </w:p>
+    <w:p>
+      <w:pPr>
+        <w:pStyle w:val="Heading2"/>
+      </w:pPr>
+      <w:r>
+        <w:t>User-facing post access modes</w:t>
+      </w:r>
+    </w:p>
+    <w:p>
+      <w:r>
+        <w:t>Free posts: full article is open. At the end of the article, inject a support CTA using Saweria and/or Buy Me Coffee links configured in Site Settings.</w:t>
+      </w:r>
+    </w:p>
+    <w:p>
+      <w:r>
+        <w:t>Tips posts: article can show preview first, then ask the reader to tip before unlocking. Default tip choices are Rp10.000, Rp15.000, and Rp20.000.</w:t>
+      </w:r>
+    </w:p>
+    <w:p>
+      <w:r>
+        <w:t>Paid posts: article shows preview/paywall first. Reader pays the configured price before accessing the full article.</w:t>
+      </w:r>
+    </w:p>
+    <w:p>
+      <w:r>
+        <w:t>No multi-login requirement for the first paid-content version. Use buyer email plus private access token link after payment succeeds.</w:t>
+      </w:r>
+    </w:p>
+    <w:p>
+      <w:pPr>
+        <w:pStyle w:val="Heading2"/>
+      </w:pPr>
+      <w:r>
+        <w:t>Product commerce direction</w:t>
+      </w:r>
+    </w:p>
+    <w:p>
+      <w:r>
+        <w:t>Products continue to support manual checkout_url for MVP, typically a Midtrans Payment Link.</w:t>
+      </w:r>
+    </w:p>
+    <w:p>
+      <w:r>
+        <w:t>Future proper commerce uses Midtrans Snap/API, Midtrans HTTP notification/webhook, orders, access grants, and fulfillment states.</w:t>
+      </w:r>
+    </w:p>
+    <w:p>
+      <w:r>
+        <w:t>Digital products may unlock automatically through an access/download token after paid webhook confirmation.</w:t>
+      </w:r>
+    </w:p>
+    <w:p>
+      <w:r>
+        <w:t>Physical products can start with manual fulfillment after payment confirmation.</w:t>
+      </w:r>
+    </w:p>
+    <w:p>
+      <w:pPr>
+        <w:pStyle w:val="Heading2"/>
+      </w:pPr>
+      <w:r>
+        <w:t>Support links</w:t>
+      </w:r>
+    </w:p>
+    <w:p>
+      <w:r>
+        <w:t>Site Settings should store Saweria URL, Buy Me Coffee URL, tips CTA title, and tips CTA body. These are donation/support links; they do not automatically unlock paid content.</w:t>
+      </w:r>
+    </w:p>
+    <w:p>
+      <w:r>
+        <w:t>Sources to use during implementation: Midtrans Snap docs, Midtrans Snap integration guide, and Midtrans HTTP notification/webhooks docs.</w:t>
+      </w:r>
+    </w:p>
     <w:sectPr>
       <w:footerReference w:type="default" r:id="rId9"/>
       <w:pgSz w:w="12240" w:h="15840"/>

</xml_diff>

<commit_message>
Improve admin writing editor
</commit_message>
<xml_diff>
--- a/docs/product/PRD_Personal_Brand_Platform_COMMERCE_READY.docx
+++ b/docs/product/PRD_Personal_Brand_Platform_COMMERCE_READY.docx
@@ -5297,6 +5297,83 @@
         <w:t>Sources to use during implementation: Midtrans Snap docs, Midtrans Snap integration guide, and Midtrans HTTP notification/webhooks docs.</w:t>
       </w:r>
     </w:p>
+    <w:p>
+      <w:r>
+        <w:br w:type="page"/>
+      </w:r>
+    </w:p>
+    <w:p>
+      <w:pPr>
+        <w:pStyle w:val="Heading1"/>
+      </w:pPr>
+      <w:r>
+        <w:t>Writing CMS Addendum - Markdown-First Editor and SEO</w:t>
+      </w:r>
+    </w:p>
+    <w:p>
+      <w:pPr/>
+      <w:r>
+        <w:t>The Writing feature should use a proper Markdown-first editor rather than a WordPress-style block editor in the near term. The recommended MVP editor is EasyMDE because it upgrades the existing textarea workflow with toolbar, preview, side-by-side mode, table/link/image helpers, and fullscreen writing without changing the Backpex form contract.</w:t>
+      </w:r>
+    </w:p>
+    <w:p>
+      <w:pPr/>
+      <w:r>
+        <w:t>Post creation must support title, generated slug, excerpt, Markdown content, tags, status, featured flag, publish date, reading time, cover image, Open Graph image, SEO title, and SEO description.</w:t>
+      </w:r>
+    </w:p>
+    <w:p>
+      <w:pPr/>
+      <w:r>
+        <w:t>The public writing detail page should use SEO-specific fields when present: SEO title before post title, SEO description before excerpt, and Open Graph image before cover image. Canonical URL support remains required for SEO polish.</w:t>
+      </w:r>
+    </w:p>
+    <w:p>
+      <w:pPr/>
+      <w:r>
+        <w:t>The product should not build a full WordPress/Gutenberg-style block editor in this phase. A block editor can be reconsidered only if Markdown becomes limiting for media-rich or commerce-heavy writing.</w:t>
+      </w:r>
+    </w:p>
+    <w:p>
+      <w:pPr>
+        <w:pStyle w:val="Heading2"/>
+      </w:pPr>
+      <w:r>
+        <w:t>Acceptance Criteria</w:t>
+      </w:r>
+    </w:p>
+    <w:p>
+      <w:pPr>
+        <w:pStyle w:val="ListBullet"/>
+      </w:pPr>
+      <w:r>
+        <w:t>EasyMDE Markdown editor is available in Admin &gt; Posts.</w:t>
+      </w:r>
+    </w:p>
+    <w:p>
+      <w:pPr>
+        <w:pStyle w:val="ListBullet"/>
+      </w:pPr>
+      <w:r>
+        <w:t>Cover image and optional social sharing image can be selected from Media.</w:t>
+      </w:r>
+    </w:p>
+    <w:p>
+      <w:pPr>
+        <w:pStyle w:val="ListBullet"/>
+      </w:pPr>
+      <w:r>
+        <w:t>Writing pages use SEO title/description/image fallbacks correctly.</w:t>
+      </w:r>
+    </w:p>
+    <w:p>
+      <w:pPr>
+        <w:pStyle w:val="ListBullet"/>
+      </w:pPr>
+      <w:r>
+        <w:t>Future paid/tips posts preserve the same writing/editor model and add monetization fields later.</w:t>
+      </w:r>
+    </w:p>
     <w:sectPr>
       <w:footerReference w:type="default" r:id="rId9"/>
       <w:pgSz w:w="12240" w:h="15840"/>

</xml_diff>